<commit_message>
Added all required files for Task 01 submission
</commit_message>
<xml_diff>
--- a/CyberSecurity-Task01-NetworkScanning/Task01.docx
+++ b/CyberSecurity-Task01-NetworkScanning/Task01.docx
@@ -386,18 +386,8 @@
                 <w:sz w:val="36"/>
                 <w:szCs w:val="36"/>
               </w:rPr>
-              <w:t xml:space="preserve"> </w:t>
-            </w:r>
-            <w:proofErr w:type="spellStart"/>
-            <w:r>
-              <w:rPr>
-                <w:rFonts w:ascii="Times New Roman" w:hAnsi="Times New Roman" w:cs="Times New Roman"/>
-                <w:sz w:val="36"/>
-                <w:szCs w:val="36"/>
-              </w:rPr>
-              <w:t>Infobyte</w:t>
-            </w:r>
-            <w:proofErr w:type="spellEnd"/>
+              <w:t xml:space="preserve"> Infobyte</w:t>
+            </w:r>
           </w:p>
         </w:tc>
       </w:tr>
@@ -478,6 +468,7 @@
       <w:r>
         <w:rPr>
           <w:rFonts w:ascii="Times New Roman" w:hAnsi="Times New Roman" w:cs="Times New Roman"/>
+          <w:noProof/>
         </w:rPr>
         <w:drawing>
           <wp:inline distT="0" distB="0" distL="0" distR="0" wp14:anchorId="592213B8" wp14:editId="7426EF76">
@@ -679,15 +670,15 @@
         <w:spacing w:before="100" w:after="100"/>
         <w:rPr>
           <w:rFonts w:ascii="Times New Roman" w:hAnsi="Times New Roman" w:cs="Times New Roman"/>
-          <w:sz w:val="28"/>
-          <w:szCs w:val="28"/>
-        </w:rPr>
-      </w:pPr>
-      <w:r>
-        <w:rPr>
-          <w:rFonts w:ascii="Times New Roman" w:hAnsi="Times New Roman" w:cs="Times New Roman"/>
-          <w:sz w:val="28"/>
-          <w:szCs w:val="28"/>
+          <w:sz w:val="24"/>
+          <w:szCs w:val="24"/>
+        </w:rPr>
+      </w:pPr>
+      <w:r>
+        <w:rPr>
+          <w:rFonts w:ascii="Times New Roman" w:hAnsi="Times New Roman" w:cs="Times New Roman"/>
+          <w:sz w:val="24"/>
+          <w:szCs w:val="24"/>
         </w:rPr>
         <w:t>1.  Summary</w:t>
       </w:r>
@@ -695,8 +686,8 @@
         <w:rPr>
           <w:rFonts w:ascii="Times New Roman" w:hAnsi="Times New Roman" w:cs="Times New Roman"/>
           <w:color w:val="1A5C5A"/>
-          <w:sz w:val="28"/>
-          <w:szCs w:val="28"/>
+          <w:sz w:val="24"/>
+          <w:szCs w:val="24"/>
         </w:rPr>
         <w:tab/>
         <w:t>3</w:t>
@@ -710,15 +701,15 @@
         <w:spacing w:before="100" w:after="100"/>
         <w:rPr>
           <w:rFonts w:ascii="Times New Roman" w:hAnsi="Times New Roman" w:cs="Times New Roman"/>
-          <w:sz w:val="28"/>
-          <w:szCs w:val="28"/>
-        </w:rPr>
-      </w:pPr>
-      <w:r>
-        <w:rPr>
-          <w:rFonts w:ascii="Times New Roman" w:hAnsi="Times New Roman" w:cs="Times New Roman"/>
-          <w:sz w:val="28"/>
-          <w:szCs w:val="28"/>
+          <w:sz w:val="24"/>
+          <w:szCs w:val="24"/>
+        </w:rPr>
+      </w:pPr>
+      <w:r>
+        <w:rPr>
+          <w:rFonts w:ascii="Times New Roman" w:hAnsi="Times New Roman" w:cs="Times New Roman"/>
+          <w:sz w:val="24"/>
+          <w:szCs w:val="24"/>
         </w:rPr>
         <w:t>2.  Scope</w:t>
       </w:r>
@@ -726,8 +717,8 @@
         <w:rPr>
           <w:rFonts w:ascii="Times New Roman" w:hAnsi="Times New Roman" w:cs="Times New Roman"/>
           <w:color w:val="1A5C5A"/>
-          <w:sz w:val="28"/>
-          <w:szCs w:val="28"/>
+          <w:sz w:val="24"/>
+          <w:szCs w:val="24"/>
         </w:rPr>
         <w:tab/>
         <w:t>3</w:t>
@@ -741,15 +732,15 @@
         <w:spacing w:before="100" w:after="100"/>
         <w:rPr>
           <w:rFonts w:ascii="Times New Roman" w:hAnsi="Times New Roman" w:cs="Times New Roman"/>
-          <w:sz w:val="28"/>
-          <w:szCs w:val="28"/>
-        </w:rPr>
-      </w:pPr>
-      <w:r>
-        <w:rPr>
-          <w:rFonts w:ascii="Times New Roman" w:hAnsi="Times New Roman" w:cs="Times New Roman"/>
-          <w:sz w:val="28"/>
-          <w:szCs w:val="28"/>
+          <w:sz w:val="24"/>
+          <w:szCs w:val="24"/>
+        </w:rPr>
+      </w:pPr>
+      <w:r>
+        <w:rPr>
+          <w:rFonts w:ascii="Times New Roman" w:hAnsi="Times New Roman" w:cs="Times New Roman"/>
+          <w:sz w:val="24"/>
+          <w:szCs w:val="24"/>
         </w:rPr>
         <w:t>3.  Environment Setup</w:t>
       </w:r>
@@ -757,8 +748,8 @@
         <w:rPr>
           <w:rFonts w:ascii="Times New Roman" w:hAnsi="Times New Roman" w:cs="Times New Roman"/>
           <w:color w:val="1A5C5A"/>
-          <w:sz w:val="28"/>
-          <w:szCs w:val="28"/>
+          <w:sz w:val="24"/>
+          <w:szCs w:val="24"/>
         </w:rPr>
         <w:tab/>
         <w:t>3</w:t>
@@ -772,15 +763,15 @@
         <w:spacing w:before="100" w:after="100"/>
         <w:rPr>
           <w:rFonts w:ascii="Times New Roman" w:hAnsi="Times New Roman" w:cs="Times New Roman"/>
-          <w:sz w:val="28"/>
-          <w:szCs w:val="28"/>
-        </w:rPr>
-      </w:pPr>
-      <w:r>
-        <w:rPr>
-          <w:rFonts w:ascii="Times New Roman" w:hAnsi="Times New Roman" w:cs="Times New Roman"/>
-          <w:sz w:val="28"/>
-          <w:szCs w:val="28"/>
+          <w:sz w:val="24"/>
+          <w:szCs w:val="24"/>
+        </w:rPr>
+      </w:pPr>
+      <w:r>
+        <w:rPr>
+          <w:rFonts w:ascii="Times New Roman" w:hAnsi="Times New Roman" w:cs="Times New Roman"/>
+          <w:sz w:val="24"/>
+          <w:szCs w:val="24"/>
         </w:rPr>
         <w:t>4.  Methodology</w:t>
       </w:r>
@@ -788,8 +779,8 @@
         <w:rPr>
           <w:rFonts w:ascii="Times New Roman" w:hAnsi="Times New Roman" w:cs="Times New Roman"/>
           <w:color w:val="1A5C5A"/>
-          <w:sz w:val="28"/>
-          <w:szCs w:val="28"/>
+          <w:sz w:val="24"/>
+          <w:szCs w:val="24"/>
         </w:rPr>
         <w:tab/>
         <w:t>4</w:t>
@@ -803,31 +794,31 @@
         <w:spacing w:before="100" w:after="100"/>
         <w:rPr>
           <w:rFonts w:ascii="Times New Roman" w:hAnsi="Times New Roman" w:cs="Times New Roman"/>
-          <w:sz w:val="28"/>
-          <w:szCs w:val="28"/>
-        </w:rPr>
-      </w:pPr>
-      <w:r>
-        <w:rPr>
-          <w:rFonts w:ascii="Times New Roman" w:hAnsi="Times New Roman" w:cs="Times New Roman"/>
-          <w:sz w:val="28"/>
-          <w:szCs w:val="28"/>
+          <w:sz w:val="24"/>
+          <w:szCs w:val="24"/>
+        </w:rPr>
+      </w:pPr>
+      <w:r>
+        <w:rPr>
+          <w:rFonts w:ascii="Times New Roman" w:hAnsi="Times New Roman" w:cs="Times New Roman"/>
+          <w:sz w:val="24"/>
+          <w:szCs w:val="24"/>
         </w:rPr>
         <w:t xml:space="preserve">   4.1.  Step 1 </w:t>
       </w:r>
       <w:r>
         <w:rPr>
           <w:rFonts w:ascii="Times New Roman" w:hAnsi="Times New Roman" w:cs="Times New Roman"/>
-          <w:sz w:val="28"/>
-          <w:szCs w:val="28"/>
+          <w:sz w:val="24"/>
+          <w:szCs w:val="24"/>
         </w:rPr>
         <w:t>-</w:t>
       </w:r>
       <w:r>
         <w:rPr>
           <w:rFonts w:ascii="Times New Roman" w:hAnsi="Times New Roman" w:cs="Times New Roman"/>
-          <w:sz w:val="28"/>
-          <w:szCs w:val="28"/>
+          <w:sz w:val="24"/>
+          <w:szCs w:val="24"/>
         </w:rPr>
         <w:t xml:space="preserve"> Basic Nmap Scan</w:t>
       </w:r>
@@ -835,8 +826,8 @@
         <w:rPr>
           <w:rFonts w:ascii="Times New Roman" w:hAnsi="Times New Roman" w:cs="Times New Roman"/>
           <w:color w:val="1A5C5A"/>
-          <w:sz w:val="28"/>
-          <w:szCs w:val="28"/>
+          <w:sz w:val="24"/>
+          <w:szCs w:val="24"/>
         </w:rPr>
         <w:tab/>
         <w:t>4</w:t>
@@ -850,58 +841,40 @@
         <w:spacing w:before="100" w:after="100"/>
         <w:rPr>
           <w:rFonts w:ascii="Times New Roman" w:hAnsi="Times New Roman" w:cs="Times New Roman"/>
-          <w:sz w:val="28"/>
-          <w:szCs w:val="28"/>
-        </w:rPr>
-      </w:pPr>
-      <w:r>
-        <w:rPr>
-          <w:rFonts w:ascii="Times New Roman" w:hAnsi="Times New Roman" w:cs="Times New Roman"/>
-          <w:sz w:val="28"/>
-          <w:szCs w:val="28"/>
+          <w:sz w:val="24"/>
+          <w:szCs w:val="24"/>
+        </w:rPr>
+      </w:pPr>
+      <w:r>
+        <w:rPr>
+          <w:rFonts w:ascii="Times New Roman" w:hAnsi="Times New Roman" w:cs="Times New Roman"/>
+          <w:sz w:val="24"/>
+          <w:szCs w:val="24"/>
         </w:rPr>
         <w:t xml:space="preserve">   4.2.  Step 2 </w:t>
       </w:r>
       <w:r>
         <w:rPr>
           <w:rFonts w:ascii="Times New Roman" w:hAnsi="Times New Roman" w:cs="Times New Roman"/>
-          <w:sz w:val="28"/>
-          <w:szCs w:val="28"/>
+          <w:sz w:val="24"/>
+          <w:szCs w:val="24"/>
         </w:rPr>
         <w:t>-</w:t>
       </w:r>
       <w:r>
         <w:rPr>
           <w:rFonts w:ascii="Times New Roman" w:hAnsi="Times New Roman" w:cs="Times New Roman"/>
-          <w:sz w:val="28"/>
-          <w:szCs w:val="28"/>
-        </w:rPr>
-        <w:t xml:space="preserve"> Service Version Scan (-</w:t>
-      </w:r>
-      <w:proofErr w:type="spellStart"/>
-      <w:r>
-        <w:rPr>
-          <w:rFonts w:ascii="Times New Roman" w:hAnsi="Times New Roman" w:cs="Times New Roman"/>
-          <w:sz w:val="28"/>
-          <w:szCs w:val="28"/>
-        </w:rPr>
-        <w:t>sV</w:t>
-      </w:r>
-      <w:proofErr w:type="spellEnd"/>
-      <w:r>
-        <w:rPr>
-          <w:rFonts w:ascii="Times New Roman" w:hAnsi="Times New Roman" w:cs="Times New Roman"/>
-          <w:sz w:val="28"/>
-          <w:szCs w:val="28"/>
-        </w:rPr>
-        <w:t>)</w:t>
+          <w:sz w:val="24"/>
+          <w:szCs w:val="24"/>
+        </w:rPr>
+        <w:t xml:space="preserve"> Service Version Scan (-sV)</w:t>
       </w:r>
       <w:r>
         <w:rPr>
           <w:rFonts w:ascii="Times New Roman" w:hAnsi="Times New Roman" w:cs="Times New Roman"/>
           <w:color w:val="1A5C5A"/>
-          <w:sz w:val="28"/>
-          <w:szCs w:val="28"/>
+          <w:sz w:val="24"/>
+          <w:szCs w:val="24"/>
         </w:rPr>
         <w:tab/>
         <w:t>5</w:t>
@@ -915,31 +888,31 @@
         <w:spacing w:before="100" w:after="100"/>
         <w:rPr>
           <w:rFonts w:ascii="Times New Roman" w:hAnsi="Times New Roman" w:cs="Times New Roman"/>
-          <w:sz w:val="28"/>
-          <w:szCs w:val="28"/>
-        </w:rPr>
-      </w:pPr>
-      <w:r>
-        <w:rPr>
-          <w:rFonts w:ascii="Times New Roman" w:hAnsi="Times New Roman" w:cs="Times New Roman"/>
-          <w:sz w:val="28"/>
-          <w:szCs w:val="28"/>
+          <w:sz w:val="24"/>
+          <w:szCs w:val="24"/>
+        </w:rPr>
+      </w:pPr>
+      <w:r>
+        <w:rPr>
+          <w:rFonts w:ascii="Times New Roman" w:hAnsi="Times New Roman" w:cs="Times New Roman"/>
+          <w:sz w:val="24"/>
+          <w:szCs w:val="24"/>
         </w:rPr>
         <w:t xml:space="preserve">   4.3.  Step 3 </w:t>
       </w:r>
       <w:r>
         <w:rPr>
           <w:rFonts w:ascii="Times New Roman" w:hAnsi="Times New Roman" w:cs="Times New Roman"/>
-          <w:sz w:val="28"/>
-          <w:szCs w:val="28"/>
+          <w:sz w:val="24"/>
+          <w:szCs w:val="24"/>
         </w:rPr>
         <w:t>-</w:t>
       </w:r>
       <w:r>
         <w:rPr>
           <w:rFonts w:ascii="Times New Roman" w:hAnsi="Times New Roman" w:cs="Times New Roman"/>
-          <w:sz w:val="28"/>
-          <w:szCs w:val="28"/>
+          <w:sz w:val="24"/>
+          <w:szCs w:val="24"/>
         </w:rPr>
         <w:t xml:space="preserve"> OS Detection Scan (-O)</w:t>
       </w:r>
@@ -947,8 +920,8 @@
         <w:rPr>
           <w:rFonts w:ascii="Times New Roman" w:hAnsi="Times New Roman" w:cs="Times New Roman"/>
           <w:color w:val="1A5C5A"/>
-          <w:sz w:val="28"/>
-          <w:szCs w:val="28"/>
+          <w:sz w:val="24"/>
+          <w:szCs w:val="24"/>
         </w:rPr>
         <w:tab/>
         <w:t>6</w:t>
@@ -963,16 +936,16 @@
         <w:rPr>
           <w:rFonts w:ascii="Times New Roman" w:hAnsi="Times New Roman" w:cs="Times New Roman"/>
           <w:color w:val="000000" w:themeColor="text1"/>
-          <w:sz w:val="28"/>
-          <w:szCs w:val="28"/>
-        </w:rPr>
-      </w:pPr>
-      <w:r>
-        <w:rPr>
-          <w:rFonts w:ascii="Times New Roman" w:hAnsi="Times New Roman" w:cs="Times New Roman"/>
-          <w:color w:val="000000" w:themeColor="text1"/>
-          <w:sz w:val="28"/>
-          <w:szCs w:val="28"/>
+          <w:sz w:val="24"/>
+          <w:szCs w:val="24"/>
+        </w:rPr>
+      </w:pPr>
+      <w:r>
+        <w:rPr>
+          <w:rFonts w:ascii="Times New Roman" w:hAnsi="Times New Roman" w:cs="Times New Roman"/>
+          <w:color w:val="000000" w:themeColor="text1"/>
+          <w:sz w:val="24"/>
+          <w:szCs w:val="24"/>
         </w:rPr>
         <w:t>5.  Scan Results Documentation</w:t>
       </w:r>
@@ -980,8 +953,8 @@
         <w:rPr>
           <w:rFonts w:ascii="Times New Roman" w:hAnsi="Times New Roman" w:cs="Times New Roman"/>
           <w:color w:val="000000" w:themeColor="text1"/>
-          <w:sz w:val="28"/>
-          <w:szCs w:val="28"/>
+          <w:sz w:val="24"/>
+          <w:szCs w:val="24"/>
         </w:rPr>
         <w:tab/>
       </w:r>
@@ -989,8 +962,8 @@
         <w:rPr>
           <w:rFonts w:ascii="Times New Roman" w:hAnsi="Times New Roman" w:cs="Times New Roman"/>
           <w:color w:val="000000" w:themeColor="text1"/>
-          <w:sz w:val="28"/>
-          <w:szCs w:val="28"/>
+          <w:sz w:val="24"/>
+          <w:szCs w:val="24"/>
         </w:rPr>
         <w:t>9</w:t>
       </w:r>
@@ -1004,16 +977,16 @@
         <w:rPr>
           <w:rFonts w:ascii="Times New Roman" w:hAnsi="Times New Roman" w:cs="Times New Roman"/>
           <w:color w:val="000000" w:themeColor="text1"/>
-          <w:sz w:val="28"/>
-          <w:szCs w:val="28"/>
-        </w:rPr>
-      </w:pPr>
-      <w:r>
-        <w:rPr>
-          <w:rFonts w:ascii="Times New Roman" w:hAnsi="Times New Roman" w:cs="Times New Roman"/>
-          <w:color w:val="000000" w:themeColor="text1"/>
-          <w:sz w:val="28"/>
-          <w:szCs w:val="28"/>
+          <w:sz w:val="24"/>
+          <w:szCs w:val="24"/>
+        </w:rPr>
+      </w:pPr>
+      <w:r>
+        <w:rPr>
+          <w:rFonts w:ascii="Times New Roman" w:hAnsi="Times New Roman" w:cs="Times New Roman"/>
+          <w:color w:val="000000" w:themeColor="text1"/>
+          <w:sz w:val="24"/>
+          <w:szCs w:val="24"/>
         </w:rPr>
         <w:t>6.  Port Analysis &amp; Security Assessment</w:t>
       </w:r>
@@ -1021,8 +994,8 @@
         <w:rPr>
           <w:rFonts w:ascii="Times New Roman" w:hAnsi="Times New Roman" w:cs="Times New Roman"/>
           <w:color w:val="000000" w:themeColor="text1"/>
-          <w:sz w:val="28"/>
-          <w:szCs w:val="28"/>
+          <w:sz w:val="24"/>
+          <w:szCs w:val="24"/>
         </w:rPr>
         <w:tab/>
       </w:r>
@@ -1030,8 +1003,8 @@
         <w:rPr>
           <w:rFonts w:ascii="Times New Roman" w:hAnsi="Times New Roman" w:cs="Times New Roman"/>
           <w:color w:val="000000" w:themeColor="text1"/>
-          <w:sz w:val="28"/>
-          <w:szCs w:val="28"/>
+          <w:sz w:val="24"/>
+          <w:szCs w:val="24"/>
         </w:rPr>
         <w:t>9</w:t>
       </w:r>
@@ -1044,16 +1017,16 @@
         <w:spacing w:before="100" w:after="100"/>
         <w:rPr>
           <w:rFonts w:ascii="Times New Roman" w:hAnsi="Times New Roman" w:cs="Times New Roman"/>
-          <w:sz w:val="28"/>
-          <w:szCs w:val="28"/>
-        </w:rPr>
-      </w:pPr>
-      <w:r>
-        <w:rPr>
-          <w:rFonts w:ascii="Times New Roman" w:hAnsi="Times New Roman" w:cs="Times New Roman"/>
-          <w:color w:val="000000" w:themeColor="text1"/>
-          <w:sz w:val="28"/>
-          <w:szCs w:val="28"/>
+          <w:sz w:val="24"/>
+          <w:szCs w:val="24"/>
+        </w:rPr>
+      </w:pPr>
+      <w:r>
+        <w:rPr>
+          <w:rFonts w:ascii="Times New Roman" w:hAnsi="Times New Roman" w:cs="Times New Roman"/>
+          <w:color w:val="000000" w:themeColor="text1"/>
+          <w:sz w:val="24"/>
+          <w:szCs w:val="24"/>
         </w:rPr>
         <w:t>7. Key Findings</w:t>
       </w:r>
@@ -1061,31 +1034,26 @@
         <w:rPr>
           <w:rFonts w:ascii="Times New Roman" w:hAnsi="Times New Roman" w:cs="Times New Roman"/>
           <w:color w:val="1A5C5A"/>
-          <w:sz w:val="28"/>
-          <w:szCs w:val="28"/>
+          <w:sz w:val="24"/>
+          <w:szCs w:val="24"/>
         </w:rPr>
         <w:tab/>
-        <w:t>1</w:t>
-      </w:r>
-      <w:r>
-        <w:rPr>
-          <w:rFonts w:ascii="Times New Roman" w:hAnsi="Times New Roman" w:cs="Times New Roman"/>
-          <w:color w:val="1A5C5A"/>
-          <w:sz w:val="28"/>
-          <w:szCs w:val="28"/>
-        </w:rPr>
-        <w:t>1</w:t>
-      </w:r>
-    </w:p>
-    <w:p>
-      <w:pPr>
-        <w:rPr>
-          <w:rFonts w:ascii="Times New Roman" w:hAnsi="Times New Roman" w:cs="Times New Roman"/>
-        </w:rPr>
-      </w:pPr>
-      <w:r>
-        <w:rPr>
-          <w:rFonts w:ascii="Times New Roman" w:hAnsi="Times New Roman" w:cs="Times New Roman"/>
+        <w:t>11</w:t>
+      </w:r>
+    </w:p>
+    <w:p>
+      <w:pPr>
+        <w:rPr>
+          <w:rFonts w:ascii="Times New Roman" w:hAnsi="Times New Roman" w:cs="Times New Roman"/>
+          <w:sz w:val="18"/>
+          <w:szCs w:val="18"/>
+        </w:rPr>
+      </w:pPr>
+      <w:r>
+        <w:rPr>
+          <w:rFonts w:ascii="Times New Roman" w:hAnsi="Times New Roman" w:cs="Times New Roman"/>
+          <w:sz w:val="18"/>
+          <w:szCs w:val="18"/>
         </w:rPr>
         <w:br w:type="page"/>
       </w:r>
@@ -1130,25 +1098,7 @@
           <w:sz w:val="22"/>
           <w:szCs w:val="22"/>
         </w:rPr>
-        <w:t xml:space="preserve">This report documents the network scanning activities carried out for Task 01 of the Oasis </w:t>
-      </w:r>
-      <w:proofErr w:type="spellStart"/>
-      <w:r>
-        <w:rPr>
-          <w:rFonts w:ascii="Times New Roman" w:hAnsi="Times New Roman" w:cs="Times New Roman"/>
-          <w:sz w:val="22"/>
-          <w:szCs w:val="22"/>
-        </w:rPr>
-        <w:t>Infobyte</w:t>
-      </w:r>
-      <w:proofErr w:type="spellEnd"/>
-      <w:r>
-        <w:rPr>
-          <w:rFonts w:ascii="Times New Roman" w:hAnsi="Times New Roman" w:cs="Times New Roman"/>
-          <w:sz w:val="22"/>
-          <w:szCs w:val="22"/>
-        </w:rPr>
-        <w:t xml:space="preserve"> Cyber Security Internship. The objective of this task was to perform a structured network reconnaissance of a local virtual machine using Nmap one of the most widely used open-source network scanning tools in the security industry.</w:t>
+        <w:t>This report documents the network scanning activities carried out for Task 01 of the Oasis Infobyte Cyber Security Internship. The objective of this task was to perform a structured network reconnaissance of a local virtual machine using Nmap one of the most widely used open-source network scanning tools in the security industry.</w:t>
       </w:r>
     </w:p>
     <w:p>
@@ -1274,25 +1224,7 @@
                 <w:sz w:val="22"/>
                 <w:szCs w:val="22"/>
               </w:rPr>
-              <w:t xml:space="preserve"> localhost or </w:t>
-            </w:r>
-            <w:proofErr w:type="gramStart"/>
-            <w:r>
-              <w:rPr>
-                <w:rFonts w:ascii="Times New Roman" w:hAnsi="Times New Roman" w:cs="Times New Roman"/>
-                <w:sz w:val="22"/>
-                <w:szCs w:val="22"/>
-              </w:rPr>
-              <w:t>192.168.x</w:t>
-            </w:r>
-            <w:proofErr w:type="gramEnd"/>
-            <w:r>
-              <w:rPr>
-                <w:rFonts w:ascii="Times New Roman" w:hAnsi="Times New Roman" w:cs="Times New Roman"/>
-                <w:sz w:val="22"/>
-                <w:szCs w:val="22"/>
-              </w:rPr>
-              <w:t>.x</w:t>
+              <w:t xml:space="preserve"> localhost or 192.168.x.x</w:t>
             </w:r>
           </w:p>
         </w:tc>
@@ -1714,31 +1646,7 @@
           <w:sz w:val="22"/>
           <w:szCs w:val="22"/>
         </w:rPr>
-        <w:t xml:space="preserve">sudo apt update &amp;&amp; sudo apt install </w:t>
-      </w:r>
-      <w:proofErr w:type="spellStart"/>
-      <w:r>
-        <w:rPr>
-          <w:rFonts w:ascii="Times New Roman" w:eastAsia="Courier New" w:hAnsi="Times New Roman" w:cs="Times New Roman"/>
-          <w:b/>
-          <w:bCs/>
-          <w:color w:val="000000" w:themeColor="text1"/>
-          <w:sz w:val="22"/>
-          <w:szCs w:val="22"/>
-        </w:rPr>
-        <w:t>nmap</w:t>
-      </w:r>
-      <w:proofErr w:type="spellEnd"/>
-      <w:r>
-        <w:rPr>
-          <w:rFonts w:ascii="Times New Roman" w:eastAsia="Courier New" w:hAnsi="Times New Roman" w:cs="Times New Roman"/>
-          <w:b/>
-          <w:bCs/>
-          <w:color w:val="000000" w:themeColor="text1"/>
-          <w:sz w:val="22"/>
-          <w:szCs w:val="22"/>
-        </w:rPr>
-        <w:t xml:space="preserve"> -y</w:t>
+        <w:t>sudo apt update &amp;&amp; sudo apt install nmap -y</w:t>
       </w:r>
     </w:p>
     <w:p>
@@ -1752,6 +1660,7 @@
       <w:r>
         <w:rPr>
           <w:rFonts w:ascii="Times New Roman" w:hAnsi="Times New Roman" w:cs="Times New Roman"/>
+          <w:noProof/>
           <w:color w:val="000000" w:themeColor="text1"/>
         </w:rPr>
         <w:drawing>
@@ -1894,7 +1803,6 @@
           <w:szCs w:val="22"/>
         </w:rPr>
       </w:pPr>
-      <w:proofErr w:type="spellStart"/>
       <w:r>
         <w:rPr>
           <w:rFonts w:ascii="Times New Roman" w:eastAsia="Courier New" w:hAnsi="Times New Roman" w:cs="Times New Roman"/>
@@ -1904,34 +1812,23 @@
           <w:sz w:val="22"/>
           <w:szCs w:val="22"/>
         </w:rPr>
-        <w:t>ip</w:t>
-      </w:r>
-      <w:proofErr w:type="spellEnd"/>
-      <w:r>
-        <w:rPr>
-          <w:rFonts w:ascii="Times New Roman" w:eastAsia="Courier New" w:hAnsi="Times New Roman" w:cs="Times New Roman"/>
-          <w:b/>
-          <w:bCs/>
+        <w:t>ip a</w:t>
+      </w:r>
+    </w:p>
+    <w:p>
+      <w:pPr>
+        <w:spacing w:before="80" w:after="80"/>
+        <w:rPr>
+          <w:rFonts w:ascii="Times New Roman" w:hAnsi="Times New Roman" w:cs="Times New Roman"/>
           <w:color w:val="000000" w:themeColor="text1"/>
           <w:sz w:val="22"/>
           <w:szCs w:val="22"/>
         </w:rPr>
-        <w:t xml:space="preserve"> a</w:t>
-      </w:r>
-    </w:p>
-    <w:p>
-      <w:pPr>
-        <w:spacing w:before="80" w:after="80"/>
-        <w:rPr>
-          <w:rFonts w:ascii="Times New Roman" w:hAnsi="Times New Roman" w:cs="Times New Roman"/>
-          <w:color w:val="000000" w:themeColor="text1"/>
-          <w:sz w:val="22"/>
-          <w:szCs w:val="22"/>
-        </w:rPr>
-      </w:pPr>
-      <w:r>
-        <w:rPr>
-          <w:rFonts w:ascii="Times New Roman" w:hAnsi="Times New Roman" w:cs="Times New Roman"/>
+      </w:pPr>
+      <w:r>
+        <w:rPr>
+          <w:rFonts w:ascii="Times New Roman" w:hAnsi="Times New Roman" w:cs="Times New Roman"/>
+          <w:noProof/>
           <w:color w:val="000000" w:themeColor="text1"/>
           <w:sz w:val="22"/>
           <w:szCs w:val="22"/>
@@ -2097,7 +1994,6 @@
           <w:szCs w:val="22"/>
         </w:rPr>
       </w:pPr>
-      <w:proofErr w:type="spellStart"/>
       <w:r>
         <w:rPr>
           <w:rFonts w:ascii="Times New Roman" w:hAnsi="Times New Roman" w:cs="Times New Roman"/>
@@ -2107,9 +2003,8 @@
           <w:sz w:val="22"/>
           <w:szCs w:val="22"/>
         </w:rPr>
-        <w:t>nmap</w:t>
-      </w:r>
-      <w:proofErr w:type="spellEnd"/>
+        <w:t xml:space="preserve">nmap </w:t>
+      </w:r>
       <w:r>
         <w:rPr>
           <w:rFonts w:ascii="Times New Roman" w:hAnsi="Times New Roman" w:cs="Times New Roman"/>
@@ -2119,64 +2014,38 @@
           <w:sz w:val="22"/>
           <w:szCs w:val="22"/>
         </w:rPr>
-        <w:t xml:space="preserve"> </w:t>
-      </w:r>
-      <w:r>
-        <w:rPr>
-          <w:rFonts w:ascii="Times New Roman" w:hAnsi="Times New Roman" w:cs="Times New Roman"/>
-          <w:b/>
-          <w:bCs/>
+        <w:t>[target ip]</w:t>
+      </w:r>
+    </w:p>
+    <w:p>
+      <w:pPr>
+        <w:spacing w:before="80" w:after="80"/>
+        <w:jc w:val="both"/>
+        <w:rPr>
+          <w:rFonts w:ascii="Times New Roman" w:hAnsi="Times New Roman" w:cs="Times New Roman"/>
           <w:color w:val="000000" w:themeColor="text1"/>
           <w:sz w:val="22"/>
           <w:szCs w:val="22"/>
         </w:rPr>
-        <w:t xml:space="preserve">[target </w:t>
-      </w:r>
-      <w:proofErr w:type="spellStart"/>
-      <w:r>
-        <w:rPr>
-          <w:rFonts w:ascii="Times New Roman" w:hAnsi="Times New Roman" w:cs="Times New Roman"/>
-          <w:b/>
-          <w:bCs/>
+      </w:pPr>
+      <w:r>
+        <w:rPr>
+          <w:rFonts w:ascii="Times New Roman" w:hAnsi="Times New Roman" w:cs="Times New Roman"/>
           <w:color w:val="000000" w:themeColor="text1"/>
           <w:sz w:val="22"/>
           <w:szCs w:val="22"/>
         </w:rPr>
-        <w:t>ip</w:t>
-      </w:r>
-      <w:proofErr w:type="spellEnd"/>
-      <w:r>
-        <w:rPr>
-          <w:rFonts w:ascii="Times New Roman" w:hAnsi="Times New Roman" w:cs="Times New Roman"/>
-          <w:b/>
-          <w:bCs/>
-          <w:color w:val="000000" w:themeColor="text1"/>
-          <w:sz w:val="22"/>
-          <w:szCs w:val="22"/>
-        </w:rPr>
-        <w:t>]</w:t>
+        <w:t>This runs a default SYN scan against the 1000 most common ports. For a more thorough scan covering all 65535 ports, the following variant was also run.</w:t>
       </w:r>
     </w:p>
     <w:p>
       <w:pPr>
         <w:spacing w:before="80" w:after="80"/>
-        <w:jc w:val="both"/>
-        <w:rPr>
-          <w:rFonts w:ascii="Times New Roman" w:hAnsi="Times New Roman" w:cs="Times New Roman"/>
-          <w:color w:val="000000" w:themeColor="text1"/>
-          <w:sz w:val="22"/>
-          <w:szCs w:val="22"/>
-        </w:rPr>
-      </w:pPr>
-      <w:r>
-        <w:rPr>
-          <w:rFonts w:ascii="Times New Roman" w:hAnsi="Times New Roman" w:cs="Times New Roman"/>
-          <w:color w:val="000000" w:themeColor="text1"/>
-          <w:sz w:val="22"/>
-          <w:szCs w:val="22"/>
-        </w:rPr>
-        <w:t>This runs a default SYN scan against the 1000 most common ports. For a more thorough scan covering all 65535 ports, the following variant was also run.</w:t>
-      </w:r>
+        <w:rPr>
+          <w:rFonts w:ascii="Times New Roman" w:hAnsi="Times New Roman" w:cs="Times New Roman"/>
+          <w:color w:val="000000" w:themeColor="text1"/>
+        </w:rPr>
+      </w:pPr>
     </w:p>
     <w:p>
       <w:pPr>
@@ -2186,18 +2055,10 @@
           <w:color w:val="000000" w:themeColor="text1"/>
         </w:rPr>
       </w:pPr>
-    </w:p>
-    <w:p>
-      <w:pPr>
-        <w:spacing w:before="80" w:after="80"/>
-        <w:rPr>
-          <w:rFonts w:ascii="Times New Roman" w:hAnsi="Times New Roman" w:cs="Times New Roman"/>
-          <w:color w:val="000000" w:themeColor="text1"/>
-        </w:rPr>
-      </w:pPr>
-      <w:r>
-        <w:rPr>
-          <w:rFonts w:ascii="Times New Roman" w:hAnsi="Times New Roman" w:cs="Times New Roman"/>
+      <w:r>
+        <w:rPr>
+          <w:rFonts w:ascii="Times New Roman" w:hAnsi="Times New Roman" w:cs="Times New Roman"/>
+          <w:noProof/>
           <w:color w:val="000000" w:themeColor="text1"/>
         </w:rPr>
         <w:drawing>
@@ -2285,7 +2146,6 @@
           <w:szCs w:val="22"/>
         </w:rPr>
       </w:pPr>
-      <w:proofErr w:type="spellStart"/>
       <w:r>
         <w:rPr>
           <w:rFonts w:ascii="Times New Roman" w:eastAsia="Courier New" w:hAnsi="Times New Roman" w:cs="Times New Roman"/>
@@ -2296,71 +2156,35 @@
           <w:szCs w:val="22"/>
         </w:rPr>
         <w:lastRenderedPageBreak/>
-        <w:t>nmap</w:t>
-      </w:r>
-      <w:proofErr w:type="spellEnd"/>
-      <w:r>
-        <w:rPr>
-          <w:rFonts w:ascii="Times New Roman" w:eastAsia="Courier New" w:hAnsi="Times New Roman" w:cs="Times New Roman"/>
+        <w:t xml:space="preserve">nmap -p- </w:t>
+      </w:r>
+      <w:r>
+        <w:rPr>
+          <w:rFonts w:ascii="Times New Roman" w:hAnsi="Times New Roman" w:cs="Times New Roman"/>
           <w:b/>
           <w:bCs/>
           <w:color w:val="000000" w:themeColor="text1"/>
           <w:sz w:val="22"/>
           <w:szCs w:val="22"/>
         </w:rPr>
-        <w:t xml:space="preserve"> -p- </w:t>
-      </w:r>
-      <w:r>
-        <w:rPr>
-          <w:rFonts w:ascii="Times New Roman" w:hAnsi="Times New Roman" w:cs="Times New Roman"/>
-          <w:b/>
-          <w:bCs/>
-          <w:color w:val="000000" w:themeColor="text1"/>
+        <w:t>[target ip]</w:t>
+      </w:r>
+    </w:p>
+    <w:p>
+      <w:pPr>
+        <w:spacing w:before="80" w:after="80"/>
+        <w:rPr>
+          <w:rFonts w:ascii="Times New Roman" w:hAnsi="Times New Roman" w:cs="Times New Roman"/>
           <w:sz w:val="22"/>
           <w:szCs w:val="22"/>
         </w:rPr>
-        <w:t xml:space="preserve">[target </w:t>
-      </w:r>
-      <w:proofErr w:type="spellStart"/>
-      <w:r>
-        <w:rPr>
-          <w:rFonts w:ascii="Times New Roman" w:hAnsi="Times New Roman" w:cs="Times New Roman"/>
-          <w:b/>
-          <w:bCs/>
-          <w:color w:val="000000" w:themeColor="text1"/>
+      </w:pPr>
+      <w:r>
+        <w:rPr>
+          <w:rFonts w:ascii="Times New Roman" w:hAnsi="Times New Roman" w:cs="Times New Roman"/>
           <w:sz w:val="22"/>
           <w:szCs w:val="22"/>
         </w:rPr>
-        <w:t>ip</w:t>
-      </w:r>
-      <w:proofErr w:type="spellEnd"/>
-      <w:r>
-        <w:rPr>
-          <w:rFonts w:ascii="Times New Roman" w:hAnsi="Times New Roman" w:cs="Times New Roman"/>
-          <w:b/>
-          <w:bCs/>
-          <w:color w:val="000000" w:themeColor="text1"/>
-          <w:sz w:val="22"/>
-          <w:szCs w:val="22"/>
-        </w:rPr>
-        <w:t>]</w:t>
-      </w:r>
-    </w:p>
-    <w:p>
-      <w:pPr>
-        <w:spacing w:before="80" w:after="80"/>
-        <w:rPr>
-          <w:rFonts w:ascii="Times New Roman" w:hAnsi="Times New Roman" w:cs="Times New Roman"/>
-          <w:sz w:val="22"/>
-          <w:szCs w:val="22"/>
-        </w:rPr>
-      </w:pPr>
-      <w:r>
-        <w:rPr>
-          <w:rFonts w:ascii="Times New Roman" w:hAnsi="Times New Roman" w:cs="Times New Roman"/>
-          <w:sz w:val="22"/>
-          <w:szCs w:val="22"/>
-        </w:rPr>
         <w:t>The results of this scan were saved to a text file for documentation.</w:t>
       </w:r>
     </w:p>
@@ -2386,6 +2210,7 @@
       <w:r>
         <w:rPr>
           <w:rFonts w:ascii="Times New Roman" w:hAnsi="Times New Roman" w:cs="Times New Roman"/>
+          <w:noProof/>
           <w:color w:val="000000" w:themeColor="text1"/>
         </w:rPr>
         <w:drawing>
@@ -2445,7 +2270,6 @@
           <w:szCs w:val="22"/>
         </w:rPr>
       </w:pPr>
-      <w:proofErr w:type="spellStart"/>
       <w:r>
         <w:rPr>
           <w:rFonts w:ascii="Times New Roman" w:eastAsia="Courier New" w:hAnsi="Times New Roman" w:cs="Times New Roman"/>
@@ -2455,19 +2279,18 @@
           <w:sz w:val="22"/>
           <w:szCs w:val="22"/>
         </w:rPr>
-        <w:t>nmap</w:t>
-      </w:r>
-      <w:proofErr w:type="spellEnd"/>
-      <w:r>
-        <w:rPr>
-          <w:rFonts w:ascii="Times New Roman" w:eastAsia="Courier New" w:hAnsi="Times New Roman" w:cs="Times New Roman"/>
+        <w:t xml:space="preserve">nmap </w:t>
+      </w:r>
+      <w:r>
+        <w:rPr>
+          <w:rFonts w:ascii="Times New Roman" w:hAnsi="Times New Roman" w:cs="Times New Roman"/>
           <w:b/>
           <w:bCs/>
           <w:color w:val="000000" w:themeColor="text1"/>
           <w:sz w:val="22"/>
           <w:szCs w:val="22"/>
         </w:rPr>
-        <w:t xml:space="preserve"> </w:t>
+        <w:t>[target ip]</w:t>
       </w:r>
       <w:r>
         <w:rPr>
@@ -2478,77 +2301,18 @@
           <w:sz w:val="22"/>
           <w:szCs w:val="22"/>
         </w:rPr>
-        <w:t xml:space="preserve">[target </w:t>
-      </w:r>
-      <w:proofErr w:type="spellStart"/>
-      <w:r>
-        <w:rPr>
-          <w:rFonts w:ascii="Times New Roman" w:hAnsi="Times New Roman" w:cs="Times New Roman"/>
+        <w:t xml:space="preserve"> </w:t>
+      </w:r>
+      <w:r>
+        <w:rPr>
+          <w:rFonts w:ascii="Times New Roman" w:eastAsia="Courier New" w:hAnsi="Times New Roman" w:cs="Times New Roman"/>
           <w:b/>
           <w:bCs/>
           <w:color w:val="000000" w:themeColor="text1"/>
           <w:sz w:val="22"/>
           <w:szCs w:val="22"/>
         </w:rPr>
-        <w:t>ip</w:t>
-      </w:r>
-      <w:proofErr w:type="spellEnd"/>
-      <w:r>
-        <w:rPr>
-          <w:rFonts w:ascii="Times New Roman" w:hAnsi="Times New Roman" w:cs="Times New Roman"/>
-          <w:b/>
-          <w:bCs/>
-          <w:color w:val="000000" w:themeColor="text1"/>
-          <w:sz w:val="22"/>
-          <w:szCs w:val="22"/>
-        </w:rPr>
-        <w:t>]</w:t>
-      </w:r>
-      <w:r>
-        <w:rPr>
-          <w:rFonts w:ascii="Times New Roman" w:hAnsi="Times New Roman" w:cs="Times New Roman"/>
-          <w:b/>
-          <w:bCs/>
-          <w:color w:val="000000" w:themeColor="text1"/>
-          <w:sz w:val="22"/>
-          <w:szCs w:val="22"/>
-        </w:rPr>
-        <w:t xml:space="preserve"> </w:t>
-      </w:r>
-      <w:r>
-        <w:rPr>
-          <w:rFonts w:ascii="Times New Roman" w:eastAsia="Courier New" w:hAnsi="Times New Roman" w:cs="Times New Roman"/>
-          <w:b/>
-          <w:bCs/>
-          <w:color w:val="000000" w:themeColor="text1"/>
-          <w:sz w:val="22"/>
-          <w:szCs w:val="22"/>
-        </w:rPr>
-        <w:t>-</w:t>
-      </w:r>
-      <w:proofErr w:type="spellStart"/>
-      <w:r>
-        <w:rPr>
-          <w:rFonts w:ascii="Times New Roman" w:eastAsia="Courier New" w:hAnsi="Times New Roman" w:cs="Times New Roman"/>
-          <w:b/>
-          <w:bCs/>
-          <w:color w:val="000000" w:themeColor="text1"/>
-          <w:sz w:val="22"/>
-          <w:szCs w:val="22"/>
-        </w:rPr>
-        <w:t>oN</w:t>
-      </w:r>
-      <w:proofErr w:type="spellEnd"/>
-      <w:r>
-        <w:rPr>
-          <w:rFonts w:ascii="Times New Roman" w:eastAsia="Courier New" w:hAnsi="Times New Roman" w:cs="Times New Roman"/>
-          <w:b/>
-          <w:bCs/>
-          <w:color w:val="000000" w:themeColor="text1"/>
-          <w:sz w:val="22"/>
-          <w:szCs w:val="22"/>
-        </w:rPr>
-        <w:t xml:space="preserve"> basic_scan.txt</w:t>
+        <w:t>-oN basic_scan.txt</w:t>
       </w:r>
     </w:p>
     <w:p>
@@ -2562,6 +2326,7 @@
       <w:r>
         <w:rPr>
           <w:rFonts w:ascii="Times New Roman" w:hAnsi="Times New Roman" w:cs="Times New Roman"/>
+          <w:noProof/>
           <w:color w:val="000000" w:themeColor="text1"/>
         </w:rPr>
         <w:drawing>
@@ -2744,31 +2509,7 @@
           <w:sz w:val="24"/>
           <w:szCs w:val="24"/>
         </w:rPr>
-        <w:t>Service Version Scan (-</w:t>
-      </w:r>
-      <w:proofErr w:type="spellStart"/>
-      <w:r>
-        <w:rPr>
-          <w:rFonts w:ascii="Times New Roman" w:hAnsi="Times New Roman" w:cs="Times New Roman"/>
-          <w:b/>
-          <w:bCs/>
-          <w:color w:val="2F5496" w:themeColor="accent1" w:themeShade="BF"/>
-          <w:sz w:val="24"/>
-          <w:szCs w:val="24"/>
-        </w:rPr>
-        <w:t>sV</w:t>
-      </w:r>
-      <w:proofErr w:type="spellEnd"/>
-      <w:r>
-        <w:rPr>
-          <w:rFonts w:ascii="Times New Roman" w:hAnsi="Times New Roman" w:cs="Times New Roman"/>
-          <w:b/>
-          <w:bCs/>
-          <w:color w:val="2F5496" w:themeColor="accent1" w:themeShade="BF"/>
-          <w:sz w:val="24"/>
-          <w:szCs w:val="24"/>
-        </w:rPr>
-        <w:t>)</w:t>
+        <w:t>Service Version Scan (-sV)</w:t>
       </w:r>
     </w:p>
     <w:p>
@@ -2787,37 +2528,55 @@
           <w:sz w:val="22"/>
           <w:szCs w:val="22"/>
         </w:rPr>
-        <w:t>The second scan uses the -</w:t>
-      </w:r>
-      <w:proofErr w:type="spellStart"/>
-      <w:r>
+        <w:t>The second scan uses the -sV flag to probe open ports and determine the exact service name and version number running on each. This is critical for identifying outdated or vulnerable software versions.</w:t>
+      </w:r>
+    </w:p>
+    <w:p>
+      <w:pPr>
+        <w:spacing w:before="80"/>
+        <w:jc w:val="both"/>
         <w:rPr>
           <w:rFonts w:ascii="Times New Roman" w:hAnsi="Times New Roman" w:cs="Times New Roman"/>
           <w:sz w:val="22"/>
           <w:szCs w:val="22"/>
         </w:rPr>
-        <w:t>sV</w:t>
-      </w:r>
-      <w:proofErr w:type="spellEnd"/>
-      <w:r>
-        <w:rPr>
-          <w:rFonts w:ascii="Times New Roman" w:hAnsi="Times New Roman" w:cs="Times New Roman"/>
+      </w:pPr>
+    </w:p>
+    <w:p>
+      <w:pPr>
+        <w:spacing w:before="80" w:after="80"/>
+        <w:jc w:val="both"/>
+        <w:rPr>
+          <w:rFonts w:ascii="Times New Roman" w:hAnsi="Times New Roman" w:cs="Times New Roman"/>
+          <w:b/>
+          <w:bCs/>
+          <w:color w:val="000000" w:themeColor="text1"/>
           <w:sz w:val="22"/>
           <w:szCs w:val="22"/>
         </w:rPr>
-        <w:t xml:space="preserve"> flag to probe open ports and determine the exact service name and version number running on each. This is critical for identifying outdated or vulnerable software versions.</w:t>
-      </w:r>
-    </w:p>
-    <w:p>
-      <w:pPr>
-        <w:spacing w:before="80"/>
-        <w:jc w:val="both"/>
-        <w:rPr>
-          <w:rFonts w:ascii="Times New Roman" w:hAnsi="Times New Roman" w:cs="Times New Roman"/>
+      </w:pPr>
+      <w:r>
+        <w:rPr>
+          <w:rFonts w:ascii="Times New Roman" w:eastAsia="Courier New" w:hAnsi="Times New Roman" w:cs="Times New Roman"/>
+          <w:b/>
+          <w:bCs/>
+          <w:color w:val="000000" w:themeColor="text1"/>
           <w:sz w:val="22"/>
           <w:szCs w:val="22"/>
         </w:rPr>
-      </w:pPr>
+        <w:t xml:space="preserve">nmap -sV </w:t>
+      </w:r>
+      <w:r>
+        <w:rPr>
+          <w:rFonts w:ascii="Times New Roman" w:hAnsi="Times New Roman" w:cs="Times New Roman"/>
+          <w:b/>
+          <w:bCs/>
+          <w:color w:val="000000" w:themeColor="text1"/>
+          <w:sz w:val="22"/>
+          <w:szCs w:val="22"/>
+        </w:rPr>
+        <w:t>[target ip]</w:t>
+      </w:r>
     </w:p>
     <w:p>
       <w:pPr>
@@ -2825,132 +2584,17 @@
         <w:jc w:val="both"/>
         <w:rPr>
           <w:rFonts w:ascii="Times New Roman" w:hAnsi="Times New Roman" w:cs="Times New Roman"/>
-          <w:b/>
-          <w:bCs/>
-          <w:color w:val="000000" w:themeColor="text1"/>
           <w:sz w:val="22"/>
           <w:szCs w:val="22"/>
         </w:rPr>
       </w:pPr>
-      <w:proofErr w:type="spellStart"/>
-      <w:r>
-        <w:rPr>
-          <w:rFonts w:ascii="Times New Roman" w:eastAsia="Courier New" w:hAnsi="Times New Roman" w:cs="Times New Roman"/>
-          <w:b/>
-          <w:bCs/>
-          <w:color w:val="000000" w:themeColor="text1"/>
+      <w:r>
+        <w:rPr>
+          <w:rFonts w:ascii="Times New Roman" w:hAnsi="Times New Roman" w:cs="Times New Roman"/>
           <w:sz w:val="22"/>
           <w:szCs w:val="22"/>
         </w:rPr>
-        <w:t>nmap</w:t>
-      </w:r>
-      <w:proofErr w:type="spellEnd"/>
-      <w:r>
-        <w:rPr>
-          <w:rFonts w:ascii="Times New Roman" w:eastAsia="Courier New" w:hAnsi="Times New Roman" w:cs="Times New Roman"/>
-          <w:b/>
-          <w:bCs/>
-          <w:color w:val="000000" w:themeColor="text1"/>
-          <w:sz w:val="22"/>
-          <w:szCs w:val="22"/>
-        </w:rPr>
-        <w:t xml:space="preserve"> -</w:t>
-      </w:r>
-      <w:proofErr w:type="spellStart"/>
-      <w:r>
-        <w:rPr>
-          <w:rFonts w:ascii="Times New Roman" w:eastAsia="Courier New" w:hAnsi="Times New Roman" w:cs="Times New Roman"/>
-          <w:b/>
-          <w:bCs/>
-          <w:color w:val="000000" w:themeColor="text1"/>
-          <w:sz w:val="22"/>
-          <w:szCs w:val="22"/>
-        </w:rPr>
-        <w:t>sV</w:t>
-      </w:r>
-      <w:proofErr w:type="spellEnd"/>
-      <w:r>
-        <w:rPr>
-          <w:rFonts w:ascii="Times New Roman" w:eastAsia="Courier New" w:hAnsi="Times New Roman" w:cs="Times New Roman"/>
-          <w:b/>
-          <w:bCs/>
-          <w:color w:val="000000" w:themeColor="text1"/>
-          <w:sz w:val="22"/>
-          <w:szCs w:val="22"/>
-        </w:rPr>
-        <w:t xml:space="preserve"> </w:t>
-      </w:r>
-      <w:r>
-        <w:rPr>
-          <w:rFonts w:ascii="Times New Roman" w:hAnsi="Times New Roman" w:cs="Times New Roman"/>
-          <w:b/>
-          <w:bCs/>
-          <w:color w:val="000000" w:themeColor="text1"/>
-          <w:sz w:val="22"/>
-          <w:szCs w:val="22"/>
-        </w:rPr>
-        <w:t xml:space="preserve">[target </w:t>
-      </w:r>
-      <w:proofErr w:type="spellStart"/>
-      <w:r>
-        <w:rPr>
-          <w:rFonts w:ascii="Times New Roman" w:hAnsi="Times New Roman" w:cs="Times New Roman"/>
-          <w:b/>
-          <w:bCs/>
-          <w:color w:val="000000" w:themeColor="text1"/>
-          <w:sz w:val="22"/>
-          <w:szCs w:val="22"/>
-        </w:rPr>
-        <w:t>ip</w:t>
-      </w:r>
-      <w:proofErr w:type="spellEnd"/>
-      <w:r>
-        <w:rPr>
-          <w:rFonts w:ascii="Times New Roman" w:hAnsi="Times New Roman" w:cs="Times New Roman"/>
-          <w:b/>
-          <w:bCs/>
-          <w:color w:val="000000" w:themeColor="text1"/>
-          <w:sz w:val="22"/>
-          <w:szCs w:val="22"/>
-        </w:rPr>
-        <w:t>]</w:t>
-      </w:r>
-    </w:p>
-    <w:p>
-      <w:pPr>
-        <w:spacing w:before="80" w:after="80"/>
-        <w:jc w:val="both"/>
-        <w:rPr>
-          <w:rFonts w:ascii="Times New Roman" w:hAnsi="Times New Roman" w:cs="Times New Roman"/>
-          <w:sz w:val="22"/>
-          <w:szCs w:val="22"/>
-        </w:rPr>
-      </w:pPr>
-      <w:r>
-        <w:rPr>
-          <w:rFonts w:ascii="Times New Roman" w:hAnsi="Times New Roman" w:cs="Times New Roman"/>
-          <w:sz w:val="22"/>
-          <w:szCs w:val="22"/>
-        </w:rPr>
-        <w:t>The -</w:t>
-      </w:r>
-      <w:proofErr w:type="spellStart"/>
-      <w:r>
-        <w:rPr>
-          <w:rFonts w:ascii="Times New Roman" w:hAnsi="Times New Roman" w:cs="Times New Roman"/>
-          <w:sz w:val="22"/>
-          <w:szCs w:val="22"/>
-        </w:rPr>
-        <w:t>sV</w:t>
-      </w:r>
-      <w:proofErr w:type="spellEnd"/>
-      <w:r>
-        <w:rPr>
-          <w:rFonts w:ascii="Times New Roman" w:hAnsi="Times New Roman" w:cs="Times New Roman"/>
-          <w:sz w:val="22"/>
-          <w:szCs w:val="22"/>
-        </w:rPr>
-        <w:t xml:space="preserve"> flag intensity can be controlled. For a more aggressive version detection (slower but more accurate):</w:t>
+        <w:t>The -sV flag intensity can be controlled. For a more aggressive version detection (slower but more accurate):</w:t>
       </w:r>
     </w:p>
     <w:p>
@@ -2975,6 +2619,7 @@
       <w:r>
         <w:rPr>
           <w:rFonts w:ascii="Times New Roman" w:hAnsi="Times New Roman" w:cs="Times New Roman"/>
+          <w:noProof/>
           <w:color w:val="000000" w:themeColor="text1"/>
         </w:rPr>
         <w:drawing>
@@ -3036,7 +2681,6 @@
           <w:szCs w:val="22"/>
         </w:rPr>
       </w:pPr>
-      <w:proofErr w:type="spellStart"/>
       <w:r>
         <w:rPr>
           <w:rFonts w:ascii="Times New Roman" w:eastAsia="Courier New" w:hAnsi="Times New Roman" w:cs="Times New Roman"/>
@@ -3046,78 +2690,18 @@
           <w:sz w:val="22"/>
           <w:szCs w:val="22"/>
         </w:rPr>
-        <w:t>nmap</w:t>
-      </w:r>
-      <w:proofErr w:type="spellEnd"/>
-      <w:r>
-        <w:rPr>
-          <w:rFonts w:ascii="Times New Roman" w:eastAsia="Courier New" w:hAnsi="Times New Roman" w:cs="Times New Roman"/>
+        <w:t xml:space="preserve">nmap -sV --version-intensity 9 </w:t>
+      </w:r>
+      <w:r>
+        <w:rPr>
+          <w:rFonts w:ascii="Times New Roman" w:hAnsi="Times New Roman" w:cs="Times New Roman"/>
           <w:b/>
           <w:bCs/>
           <w:color w:val="000000" w:themeColor="text1"/>
           <w:sz w:val="22"/>
           <w:szCs w:val="22"/>
         </w:rPr>
-        <w:t xml:space="preserve"> -</w:t>
-      </w:r>
-      <w:proofErr w:type="spellStart"/>
-      <w:r>
-        <w:rPr>
-          <w:rFonts w:ascii="Times New Roman" w:eastAsia="Courier New" w:hAnsi="Times New Roman" w:cs="Times New Roman"/>
-          <w:b/>
-          <w:bCs/>
-          <w:color w:val="000000" w:themeColor="text1"/>
-          <w:sz w:val="22"/>
-          <w:szCs w:val="22"/>
-        </w:rPr>
-        <w:t>sV</w:t>
-      </w:r>
-      <w:proofErr w:type="spellEnd"/>
-      <w:r>
-        <w:rPr>
-          <w:rFonts w:ascii="Times New Roman" w:eastAsia="Courier New" w:hAnsi="Times New Roman" w:cs="Times New Roman"/>
-          <w:b/>
-          <w:bCs/>
-          <w:color w:val="000000" w:themeColor="text1"/>
-          <w:sz w:val="22"/>
-          <w:szCs w:val="22"/>
-        </w:rPr>
-        <w:t xml:space="preserve"> --version-intensity 9 </w:t>
-      </w:r>
-      <w:r>
-        <w:rPr>
-          <w:rFonts w:ascii="Times New Roman" w:hAnsi="Times New Roman" w:cs="Times New Roman"/>
-          <w:b/>
-          <w:bCs/>
-          <w:color w:val="000000" w:themeColor="text1"/>
-          <w:sz w:val="22"/>
-          <w:szCs w:val="22"/>
-        </w:rPr>
-        <w:t xml:space="preserve">[target </w:t>
-      </w:r>
-      <w:proofErr w:type="spellStart"/>
-      <w:r>
-        <w:rPr>
-          <w:rFonts w:ascii="Times New Roman" w:hAnsi="Times New Roman" w:cs="Times New Roman"/>
-          <w:b/>
-          <w:bCs/>
-          <w:color w:val="000000" w:themeColor="text1"/>
-          <w:sz w:val="22"/>
-          <w:szCs w:val="22"/>
-        </w:rPr>
-        <w:t>ip</w:t>
-      </w:r>
-      <w:proofErr w:type="spellEnd"/>
-      <w:r>
-        <w:rPr>
-          <w:rFonts w:ascii="Times New Roman" w:hAnsi="Times New Roman" w:cs="Times New Roman"/>
-          <w:b/>
-          <w:bCs/>
-          <w:color w:val="000000" w:themeColor="text1"/>
-          <w:sz w:val="22"/>
-          <w:szCs w:val="22"/>
-        </w:rPr>
-        <w:t>]</w:t>
+        <w:t>[target ip]</w:t>
       </w:r>
     </w:p>
     <w:p>
@@ -3135,6 +2719,7 @@
           <w:rFonts w:ascii="Times New Roman" w:hAnsi="Times New Roman" w:cs="Times New Roman"/>
           <w:b/>
           <w:bCs/>
+          <w:noProof/>
           <w:color w:val="000000" w:themeColor="text1"/>
         </w:rPr>
         <w:drawing>
@@ -3189,6 +2774,7 @@
           <w:rFonts w:ascii="Times New Roman" w:hAnsi="Times New Roman" w:cs="Times New Roman"/>
           <w:b/>
           <w:bCs/>
+          <w:noProof/>
           <w:color w:val="000000" w:themeColor="text1"/>
         </w:rPr>
         <w:lastRenderedPageBreak/>
@@ -3320,83 +2906,35 @@
           <w:sz w:val="22"/>
           <w:szCs w:val="22"/>
         </w:rPr>
-        <w:t xml:space="preserve">sudo </w:t>
-      </w:r>
-      <w:proofErr w:type="spellStart"/>
-      <w:r>
-        <w:rPr>
-          <w:rFonts w:ascii="Times New Roman" w:eastAsia="Courier New" w:hAnsi="Times New Roman" w:cs="Times New Roman"/>
+        <w:t xml:space="preserve">sudo nmap -O </w:t>
+      </w:r>
+      <w:r>
+        <w:rPr>
+          <w:rFonts w:ascii="Times New Roman" w:hAnsi="Times New Roman" w:cs="Times New Roman"/>
           <w:b/>
           <w:bCs/>
           <w:color w:val="000000" w:themeColor="text1"/>
           <w:sz w:val="22"/>
           <w:szCs w:val="22"/>
         </w:rPr>
-        <w:t>nmap</w:t>
-      </w:r>
-      <w:proofErr w:type="spellEnd"/>
-      <w:r>
-        <w:rPr>
-          <w:rFonts w:ascii="Times New Roman" w:eastAsia="Courier New" w:hAnsi="Times New Roman" w:cs="Times New Roman"/>
-          <w:b/>
-          <w:bCs/>
-          <w:color w:val="000000" w:themeColor="text1"/>
+        <w:t>[target ip]</w:t>
+      </w:r>
+    </w:p>
+    <w:p>
+      <w:pPr>
+        <w:spacing w:before="80" w:after="80"/>
+        <w:rPr>
+          <w:rFonts w:ascii="Times New Roman" w:hAnsi="Times New Roman" w:cs="Times New Roman"/>
           <w:sz w:val="22"/>
           <w:szCs w:val="22"/>
         </w:rPr>
-        <w:t xml:space="preserve"> -O </w:t>
-      </w:r>
-      <w:r>
-        <w:rPr>
-          <w:rFonts w:ascii="Times New Roman" w:hAnsi="Times New Roman" w:cs="Times New Roman"/>
-          <w:b/>
-          <w:bCs/>
-          <w:color w:val="000000" w:themeColor="text1"/>
+      </w:pPr>
+      <w:r>
+        <w:rPr>
+          <w:rFonts w:ascii="Times New Roman" w:hAnsi="Times New Roman" w:cs="Times New Roman"/>
           <w:sz w:val="22"/>
           <w:szCs w:val="22"/>
         </w:rPr>
-        <w:t xml:space="preserve">[target </w:t>
-      </w:r>
-      <w:proofErr w:type="spellStart"/>
-      <w:r>
-        <w:rPr>
-          <w:rFonts w:ascii="Times New Roman" w:hAnsi="Times New Roman" w:cs="Times New Roman"/>
-          <w:b/>
-          <w:bCs/>
-          <w:color w:val="000000" w:themeColor="text1"/>
-          <w:sz w:val="22"/>
-          <w:szCs w:val="22"/>
-        </w:rPr>
-        <w:t>ip</w:t>
-      </w:r>
-      <w:proofErr w:type="spellEnd"/>
-      <w:r>
-        <w:rPr>
-          <w:rFonts w:ascii="Times New Roman" w:hAnsi="Times New Roman" w:cs="Times New Roman"/>
-          <w:b/>
-          <w:bCs/>
-          <w:color w:val="000000" w:themeColor="text1"/>
-          <w:sz w:val="22"/>
-          <w:szCs w:val="22"/>
-        </w:rPr>
-        <w:t>]</w:t>
-      </w:r>
-    </w:p>
-    <w:p>
-      <w:pPr>
-        <w:spacing w:before="80" w:after="80"/>
-        <w:rPr>
-          <w:rFonts w:ascii="Times New Roman" w:hAnsi="Times New Roman" w:cs="Times New Roman"/>
-          <w:sz w:val="22"/>
-          <w:szCs w:val="22"/>
-        </w:rPr>
-      </w:pPr>
-      <w:r>
-        <w:rPr>
-          <w:rFonts w:ascii="Times New Roman" w:hAnsi="Times New Roman" w:cs="Times New Roman"/>
-          <w:sz w:val="22"/>
-          <w:szCs w:val="22"/>
-        </w:rPr>
         <w:t>An aggressive combined scan combining all three techniques was also performed for comprehensive results:</w:t>
       </w:r>
     </w:p>
@@ -3424,6 +2962,7 @@
       <w:r>
         <w:rPr>
           <w:rFonts w:ascii="Times New Roman" w:hAnsi="Times New Roman" w:cs="Times New Roman"/>
+          <w:noProof/>
           <w:color w:val="000000" w:themeColor="text1"/>
         </w:rPr>
         <w:drawing>
@@ -3581,21 +3120,19 @@
           <w:szCs w:val="22"/>
         </w:rPr>
         <w:lastRenderedPageBreak/>
-        <w:t xml:space="preserve">sudo </w:t>
-      </w:r>
-      <w:proofErr w:type="spellStart"/>
-      <w:r>
-        <w:rPr>
-          <w:rFonts w:ascii="Times New Roman" w:eastAsia="Courier New" w:hAnsi="Times New Roman" w:cs="Times New Roman"/>
+        <w:t xml:space="preserve">sudo nmap -sV -O -A </w:t>
+      </w:r>
+      <w:r>
+        <w:rPr>
+          <w:rFonts w:ascii="Times New Roman" w:hAnsi="Times New Roman" w:cs="Times New Roman"/>
           <w:b/>
           <w:bCs/>
           <w:color w:val="000000" w:themeColor="text1"/>
           <w:sz w:val="22"/>
           <w:szCs w:val="22"/>
         </w:rPr>
-        <w:t>nmap</w:t>
-      </w:r>
-      <w:proofErr w:type="spellEnd"/>
+        <w:t>[target ip]</w:t>
+      </w:r>
       <w:r>
         <w:rPr>
           <w:rFonts w:ascii="Times New Roman" w:eastAsia="Courier New" w:hAnsi="Times New Roman" w:cs="Times New Roman"/>
@@ -3605,101 +3142,7 @@
           <w:sz w:val="22"/>
           <w:szCs w:val="22"/>
         </w:rPr>
-        <w:t xml:space="preserve"> -</w:t>
-      </w:r>
-      <w:proofErr w:type="spellStart"/>
-      <w:r>
-        <w:rPr>
-          <w:rFonts w:ascii="Times New Roman" w:eastAsia="Courier New" w:hAnsi="Times New Roman" w:cs="Times New Roman"/>
-          <w:b/>
-          <w:bCs/>
-          <w:color w:val="000000" w:themeColor="text1"/>
-          <w:sz w:val="22"/>
-          <w:szCs w:val="22"/>
-        </w:rPr>
-        <w:t>sV</w:t>
-      </w:r>
-      <w:proofErr w:type="spellEnd"/>
-      <w:r>
-        <w:rPr>
-          <w:rFonts w:ascii="Times New Roman" w:eastAsia="Courier New" w:hAnsi="Times New Roman" w:cs="Times New Roman"/>
-          <w:b/>
-          <w:bCs/>
-          <w:color w:val="000000" w:themeColor="text1"/>
-          <w:sz w:val="22"/>
-          <w:szCs w:val="22"/>
-        </w:rPr>
-        <w:t xml:space="preserve"> -O -A </w:t>
-      </w:r>
-      <w:r>
-        <w:rPr>
-          <w:rFonts w:ascii="Times New Roman" w:hAnsi="Times New Roman" w:cs="Times New Roman"/>
-          <w:b/>
-          <w:bCs/>
-          <w:color w:val="000000" w:themeColor="text1"/>
-          <w:sz w:val="22"/>
-          <w:szCs w:val="22"/>
-        </w:rPr>
-        <w:t xml:space="preserve">[target </w:t>
-      </w:r>
-      <w:proofErr w:type="spellStart"/>
-      <w:r>
-        <w:rPr>
-          <w:rFonts w:ascii="Times New Roman" w:hAnsi="Times New Roman" w:cs="Times New Roman"/>
-          <w:b/>
-          <w:bCs/>
-          <w:color w:val="000000" w:themeColor="text1"/>
-          <w:sz w:val="22"/>
-          <w:szCs w:val="22"/>
-        </w:rPr>
-        <w:t>ip</w:t>
-      </w:r>
-      <w:proofErr w:type="spellEnd"/>
-      <w:r>
-        <w:rPr>
-          <w:rFonts w:ascii="Times New Roman" w:hAnsi="Times New Roman" w:cs="Times New Roman"/>
-          <w:b/>
-          <w:bCs/>
-          <w:color w:val="000000" w:themeColor="text1"/>
-          <w:sz w:val="22"/>
-          <w:szCs w:val="22"/>
-        </w:rPr>
-        <w:t>]</w:t>
-      </w:r>
-      <w:r>
-        <w:rPr>
-          <w:rFonts w:ascii="Times New Roman" w:eastAsia="Courier New" w:hAnsi="Times New Roman" w:cs="Times New Roman"/>
-          <w:b/>
-          <w:bCs/>
-          <w:color w:val="000000" w:themeColor="text1"/>
-          <w:sz w:val="22"/>
-          <w:szCs w:val="22"/>
-        </w:rPr>
-        <w:t>-</w:t>
-      </w:r>
-      <w:proofErr w:type="spellStart"/>
-      <w:r>
-        <w:rPr>
-          <w:rFonts w:ascii="Times New Roman" w:eastAsia="Courier New" w:hAnsi="Times New Roman" w:cs="Times New Roman"/>
-          <w:b/>
-          <w:bCs/>
-          <w:color w:val="000000" w:themeColor="text1"/>
-          <w:sz w:val="22"/>
-          <w:szCs w:val="22"/>
-        </w:rPr>
-        <w:t>oN</w:t>
-      </w:r>
-      <w:proofErr w:type="spellEnd"/>
-      <w:r>
-        <w:rPr>
-          <w:rFonts w:ascii="Times New Roman" w:eastAsia="Courier New" w:hAnsi="Times New Roman" w:cs="Times New Roman"/>
-          <w:b/>
-          <w:bCs/>
-          <w:color w:val="000000" w:themeColor="text1"/>
-          <w:sz w:val="22"/>
-          <w:szCs w:val="22"/>
-        </w:rPr>
-        <w:t xml:space="preserve"> full_scan.txt</w:t>
+        <w:t>-oN full_scan.txt</w:t>
       </w:r>
     </w:p>
     <w:p>
@@ -3726,6 +3169,7 @@
       <w:r>
         <w:rPr>
           <w:rFonts w:ascii="Times New Roman" w:hAnsi="Times New Roman" w:cs="Times New Roman"/>
+          <w:noProof/>
           <w:color w:val="000000" w:themeColor="text1"/>
         </w:rPr>
         <w:drawing>
@@ -3776,6 +3220,7 @@
       <w:r>
         <w:rPr>
           <w:rFonts w:ascii="Times New Roman" w:hAnsi="Times New Roman" w:cs="Times New Roman"/>
+          <w:noProof/>
           <w:color w:val="000000" w:themeColor="text1"/>
         </w:rPr>
         <w:drawing>
@@ -3826,6 +3271,7 @@
       <w:r>
         <w:rPr>
           <w:rFonts w:ascii="Times New Roman" w:hAnsi="Times New Roman" w:cs="Times New Roman"/>
+          <w:noProof/>
           <w:color w:val="000000" w:themeColor="text1"/>
         </w:rPr>
         <w:drawing>
@@ -4124,21 +3570,8 @@
                 <w:sz w:val="22"/>
                 <w:szCs w:val="22"/>
               </w:rPr>
-              <w:t>21/</w:t>
-            </w:r>
-            <w:proofErr w:type="spellStart"/>
-            <w:r>
-              <w:rPr>
-                <w:rFonts w:ascii="Times New Roman" w:eastAsia="Times New Roman" w:hAnsi="Times New Roman" w:cs="Times New Roman"/>
-                <w:b/>
-                <w:bCs/>
-                <w:color w:val="000000" w:themeColor="text1"/>
-                <w:sz w:val="22"/>
-                <w:szCs w:val="22"/>
-              </w:rPr>
-              <w:t>tcp</w:t>
-            </w:r>
-            <w:proofErr w:type="spellEnd"/>
+              <w:t>21/tcp</w:t>
+            </w:r>
           </w:p>
         </w:tc>
         <w:tc>
@@ -4208,25 +3641,14 @@
                 <w:szCs w:val="22"/>
               </w:rPr>
             </w:pPr>
-            <w:proofErr w:type="spellStart"/>
-            <w:r>
-              <w:rPr>
-                <w:rFonts w:ascii="Times New Roman" w:eastAsia="Times New Roman" w:hAnsi="Times New Roman" w:cs="Times New Roman"/>
-                <w:color w:val="000000" w:themeColor="text1"/>
-                <w:sz w:val="22"/>
-                <w:szCs w:val="22"/>
-              </w:rPr>
-              <w:t>vsftpd</w:t>
-            </w:r>
-            <w:proofErr w:type="spellEnd"/>
-            <w:r>
-              <w:rPr>
-                <w:rFonts w:ascii="Times New Roman" w:eastAsia="Times New Roman" w:hAnsi="Times New Roman" w:cs="Times New Roman"/>
-                <w:color w:val="000000" w:themeColor="text1"/>
-                <w:sz w:val="22"/>
-                <w:szCs w:val="22"/>
-              </w:rPr>
-              <w:t xml:space="preserve"> 3.0.5 - File Transfer Protocol (Plain text)</w:t>
+            <w:r>
+              <w:rPr>
+                <w:rFonts w:ascii="Times New Roman" w:eastAsia="Times New Roman" w:hAnsi="Times New Roman" w:cs="Times New Roman"/>
+                <w:color w:val="000000" w:themeColor="text1"/>
+                <w:sz w:val="22"/>
+                <w:szCs w:val="22"/>
+              </w:rPr>
+              <w:t>vsftpd 3.0.5 - File Transfer Protocol (Plain text)</w:t>
             </w:r>
           </w:p>
         </w:tc>
@@ -4259,21 +3681,8 @@
                 <w:sz w:val="22"/>
                 <w:szCs w:val="22"/>
               </w:rPr>
-              <w:t>22/</w:t>
-            </w:r>
-            <w:proofErr w:type="spellStart"/>
-            <w:r>
-              <w:rPr>
-                <w:rFonts w:ascii="Times New Roman" w:eastAsia="Times New Roman" w:hAnsi="Times New Roman" w:cs="Times New Roman"/>
-                <w:b/>
-                <w:bCs/>
-                <w:color w:val="000000" w:themeColor="text1"/>
-                <w:sz w:val="22"/>
-                <w:szCs w:val="22"/>
-              </w:rPr>
-              <w:t>tcp</w:t>
-            </w:r>
-            <w:proofErr w:type="spellEnd"/>
+              <w:t>22/tcp</w:t>
+            </w:r>
           </w:p>
         </w:tc>
         <w:tc>
@@ -4383,21 +3792,8 @@
                 <w:sz w:val="22"/>
                 <w:szCs w:val="22"/>
               </w:rPr>
-              <w:t>80/</w:t>
-            </w:r>
-            <w:proofErr w:type="spellStart"/>
-            <w:r>
-              <w:rPr>
-                <w:rFonts w:ascii="Times New Roman" w:eastAsia="Times New Roman" w:hAnsi="Times New Roman" w:cs="Times New Roman"/>
-                <w:b/>
-                <w:bCs/>
-                <w:color w:val="000000" w:themeColor="text1"/>
-                <w:sz w:val="22"/>
-                <w:szCs w:val="22"/>
-              </w:rPr>
-              <w:t>tcp</w:t>
-            </w:r>
-            <w:proofErr w:type="spellEnd"/>
+              <w:t>80/tcp</w:t>
+            </w:r>
           </w:p>
         </w:tc>
         <w:tc>
@@ -4507,21 +3903,8 @@
                 <w:sz w:val="22"/>
                 <w:szCs w:val="22"/>
               </w:rPr>
-              <w:t>3306/</w:t>
-            </w:r>
-            <w:proofErr w:type="spellStart"/>
-            <w:r>
-              <w:rPr>
-                <w:rFonts w:ascii="Times New Roman" w:eastAsia="Times New Roman" w:hAnsi="Times New Roman" w:cs="Times New Roman"/>
-                <w:b/>
-                <w:bCs/>
-                <w:color w:val="000000" w:themeColor="text1"/>
-                <w:sz w:val="22"/>
-                <w:szCs w:val="22"/>
-              </w:rPr>
-              <w:t>tcp</w:t>
-            </w:r>
-            <w:proofErr w:type="spellEnd"/>
+              <w:t>3306/tcp</w:t>
+            </w:r>
           </w:p>
         </w:tc>
         <w:tc>
@@ -4801,23 +4184,13 @@
                 <w:szCs w:val="22"/>
               </w:rPr>
             </w:pPr>
-            <w:proofErr w:type="spellStart"/>
-            <w:r>
-              <w:rPr>
-                <w:rFonts w:ascii="Times New Roman" w:hAnsi="Times New Roman" w:cs="Times New Roman"/>
-                <w:sz w:val="22"/>
-                <w:szCs w:val="22"/>
-              </w:rPr>
-              <w:t>vsftpd</w:t>
-            </w:r>
-            <w:proofErr w:type="spellEnd"/>
-            <w:r>
-              <w:rPr>
-                <w:rFonts w:ascii="Times New Roman" w:hAnsi="Times New Roman" w:cs="Times New Roman"/>
-                <w:sz w:val="22"/>
-                <w:szCs w:val="22"/>
-              </w:rPr>
-              <w:t xml:space="preserve"> 3.0.5</w:t>
+            <w:r>
+              <w:rPr>
+                <w:rFonts w:ascii="Times New Roman" w:hAnsi="Times New Roman" w:cs="Times New Roman"/>
+                <w:sz w:val="22"/>
+                <w:szCs w:val="22"/>
+              </w:rPr>
+              <w:t>vsftpd 3.0.5</w:t>
             </w:r>
           </w:p>
         </w:tc>
@@ -4979,25 +4352,7 @@
                 <w:sz w:val="22"/>
                 <w:szCs w:val="22"/>
               </w:rPr>
-              <w:t xml:space="preserve">FTP transmits credentials and data in plain text, making it vulnerable to packet sniffing and Man-in-the-Middle attacks. Anonymous FTP access may be enabled. </w:t>
-            </w:r>
-            <w:proofErr w:type="spellStart"/>
-            <w:r>
-              <w:rPr>
-                <w:rFonts w:ascii="Times New Roman" w:hAnsi="Times New Roman" w:cs="Times New Roman"/>
-                <w:sz w:val="22"/>
-                <w:szCs w:val="22"/>
-              </w:rPr>
-              <w:t>vsftpd</w:t>
-            </w:r>
-            <w:proofErr w:type="spellEnd"/>
-            <w:r>
-              <w:rPr>
-                <w:rFonts w:ascii="Times New Roman" w:hAnsi="Times New Roman" w:cs="Times New Roman"/>
-                <w:sz w:val="22"/>
-                <w:szCs w:val="22"/>
-              </w:rPr>
-              <w:t xml:space="preserve"> 3.0.5 may have undisclosed CVEs.</w:t>
+              <w:t>FTP transmits credentials and data in plain text, making it vulnerable to packet sniffing and Man-in-the-Middle attacks. Anonymous FTP access may be enabled. vsftpd 3.0.5 may have undisclosed CVEs.</w:t>
             </w:r>
           </w:p>
         </w:tc>
@@ -6275,27 +5630,7 @@
                 <w:sz w:val="22"/>
                 <w:szCs w:val="22"/>
               </w:rPr>
-              <w:t>Bind MySQL to localhost (127.0.0.1) only. Set a strong root password. Disable remote root login. Use </w:t>
-            </w:r>
-            <w:proofErr w:type="spellStart"/>
-            <w:r>
-              <w:rPr>
-                <w:rFonts w:ascii="Times New Roman" w:hAnsi="Times New Roman" w:cs="Times New Roman"/>
-                <w:color w:val="000000" w:themeColor="text1"/>
-                <w:sz w:val="22"/>
-                <w:szCs w:val="22"/>
-              </w:rPr>
-              <w:t>mysql_secure_installation</w:t>
-            </w:r>
-            <w:proofErr w:type="spellEnd"/>
-            <w:r>
-              <w:rPr>
-                <w:rFonts w:ascii="Times New Roman" w:hAnsi="Times New Roman" w:cs="Times New Roman"/>
-                <w:color w:val="000000" w:themeColor="text1"/>
-                <w:sz w:val="22"/>
-                <w:szCs w:val="22"/>
-              </w:rPr>
-              <w:t> script.</w:t>
+              <w:t>Bind MySQL to localhost (127.0.0.1) only. Set a strong root password. Disable remote root login. Use mysql_secure_installation script.</w:t>
             </w:r>
           </w:p>
         </w:tc>
@@ -6603,27 +5938,7 @@
                 <w:sz w:val="22"/>
                 <w:szCs w:val="22"/>
               </w:rPr>
-              <w:t xml:space="preserve">Plain-text file transfer with no encryption. </w:t>
-            </w:r>
-            <w:proofErr w:type="spellStart"/>
-            <w:r>
-              <w:rPr>
-                <w:rFonts w:ascii="Times New Roman" w:eastAsia="Times New Roman" w:hAnsi="Times New Roman" w:cs="Times New Roman"/>
-                <w:color w:val="000000" w:themeColor="text1"/>
-                <w:sz w:val="22"/>
-                <w:szCs w:val="22"/>
-              </w:rPr>
-              <w:t>vsftpd</w:t>
-            </w:r>
-            <w:proofErr w:type="spellEnd"/>
-            <w:r>
-              <w:rPr>
-                <w:rFonts w:ascii="Times New Roman" w:eastAsia="Times New Roman" w:hAnsi="Times New Roman" w:cs="Times New Roman"/>
-                <w:color w:val="000000" w:themeColor="text1"/>
-                <w:sz w:val="22"/>
-                <w:szCs w:val="22"/>
-              </w:rPr>
-              <w:t xml:space="preserve"> 3.0.5 exposed. Credentials and data transmitted in clear text.</w:t>
+              <w:t>Plain-text file transfer with no encryption. vsftpd 3.0.5 exposed. Credentials and data transmitted in clear text.</w:t>
             </w:r>
           </w:p>
         </w:tc>
@@ -7820,11 +7135,13 @@
   <w:style w:type="character" w:default="1" w:styleId="DefaultParagraphFont">
     <w:name w:val="Default Paragraph Font"/>
     <w:uiPriority w:val="1"/>
+    <w:semiHidden/>
     <w:unhideWhenUsed/>
   </w:style>
   <w:style w:type="table" w:default="1" w:styleId="TableNormal">
     <w:name w:val="Normal Table"/>
     <w:uiPriority w:val="99"/>
+    <w:semiHidden/>
     <w:unhideWhenUsed/>
     <w:tblPr>
       <w:tblInd w:w="0" w:type="dxa"/>

</xml_diff>